<commit_message>
tests: add common tables and tables with merged cells to test file
</commit_message>
<xml_diff>
--- a/test/template.docx
+++ b/test/template.docx
@@ -25,6 +25,7 @@
       <w:r>
         <w:t xml:space="preserve"> </w:t>
       </w:r>
+      <w:proofErr w:type="spellStart"/>
       <w:r>
         <w:rPr>
           <w:i/>
@@ -34,6 +35,7 @@
         </w:rPr>
         <w:t>СЛОВОм</w:t>
       </w:r>
+      <w:proofErr w:type="spellEnd"/>
       <w:r>
         <w:rPr>
           <w:sz w:val="32"/>
@@ -140,8 +142,30 @@
         <w:rPr>
           <w:color w:val="4472C4" w:themeColor="accent1"/>
         </w:rPr>
-        <w:t xml:space="preserve"> СЛОВО СЛОВО</w:t>
-      </w:r>
+        <w:t xml:space="preserve"> </w:t>
+      </w:r>
+      <w:proofErr w:type="spellStart"/>
+      <w:r>
+        <w:rPr>
+          <w:color w:val="4472C4" w:themeColor="accent1"/>
+        </w:rPr>
+        <w:t>СЛОВО</w:t>
+      </w:r>
+      <w:proofErr w:type="spellEnd"/>
+      <w:r>
+        <w:rPr>
+          <w:color w:val="4472C4" w:themeColor="accent1"/>
+        </w:rPr>
+        <w:t xml:space="preserve"> </w:t>
+      </w:r>
+      <w:proofErr w:type="spellStart"/>
+      <w:r>
+        <w:rPr>
+          <w:color w:val="4472C4" w:themeColor="accent1"/>
+        </w:rPr>
+        <w:t>СЛОВО</w:t>
+      </w:r>
+      <w:proofErr w:type="spellEnd"/>
       <w:r>
         <w:rPr>
           <w:color w:val="4472C4" w:themeColor="accent1"/>
@@ -200,6 +224,9 @@
         </w:rPr>
       </w:pPr>
       <w:r>
+        <w:t xml:space="preserve">СЛОВО </w:t>
+      </w:r>
+      <w:r>
         <w:t xml:space="preserve">Тут ран. </w:t>
       </w:r>
       <w:r>
@@ -256,18 +283,61 @@
         <w:rPr>
           <w:color w:val="70AD47" w:themeColor="accent6"/>
         </w:rPr>
-        <w:t>СЛОВО СЛОВО СЛОВО СЛОВО</w:t>
-      </w:r>
+        <w:t xml:space="preserve">СЛОВО </w:t>
+      </w:r>
+      <w:proofErr w:type="spellStart"/>
       <w:r>
         <w:rPr>
           <w:color w:val="70AD47" w:themeColor="accent6"/>
         </w:rPr>
-        <w:t xml:space="preserve"> С</w:t>
-      </w:r>
+        <w:t>СЛОВО</w:t>
+      </w:r>
+      <w:proofErr w:type="spellEnd"/>
       <w:r>
         <w:rPr>
           <w:color w:val="70AD47" w:themeColor="accent6"/>
         </w:rPr>
+        <w:t xml:space="preserve"> </w:t>
+      </w:r>
+      <w:proofErr w:type="spellStart"/>
+      <w:r>
+        <w:rPr>
+          <w:color w:val="70AD47" w:themeColor="accent6"/>
+        </w:rPr>
+        <w:t>СЛОВО</w:t>
+      </w:r>
+      <w:proofErr w:type="spellEnd"/>
+      <w:r>
+        <w:rPr>
+          <w:color w:val="70AD47" w:themeColor="accent6"/>
+        </w:rPr>
+        <w:t xml:space="preserve"> </w:t>
+      </w:r>
+      <w:proofErr w:type="spellStart"/>
+      <w:r>
+        <w:rPr>
+          <w:color w:val="70AD47" w:themeColor="accent6"/>
+        </w:rPr>
+        <w:t>СЛОВО</w:t>
+      </w:r>
+      <w:proofErr w:type="spellEnd"/>
+      <w:r>
+        <w:rPr>
+          <w:color w:val="70AD47" w:themeColor="accent6"/>
+        </w:rPr>
+        <w:t xml:space="preserve"> </w:t>
+      </w:r>
+      <w:proofErr w:type="spellStart"/>
+      <w:r>
+        <w:rPr>
+          <w:color w:val="70AD47" w:themeColor="accent6"/>
+        </w:rPr>
+        <w:t>С</w:t>
+      </w:r>
+      <w:r>
+        <w:rPr>
+          <w:color w:val="70AD47" w:themeColor="accent6"/>
+        </w:rPr>
         <w:t>оло</w:t>
       </w:r>
       <w:r>
@@ -276,12 +346,14 @@
         </w:rPr>
         <w:t>ЛОВО</w:t>
       </w:r>
+      <w:proofErr w:type="spellEnd"/>
       <w:r>
         <w:rPr>
           <w:color w:val="C45911" w:themeColor="accent2" w:themeShade="BF"/>
         </w:rPr>
         <w:t xml:space="preserve"> </w:t>
       </w:r>
+      <w:proofErr w:type="spellStart"/>
       <w:r>
         <w:rPr>
           <w:color w:val="4472C4" w:themeColor="accent1"/>
@@ -300,6 +372,552 @@
         </w:rPr>
         <w:t>О</w:t>
       </w:r>
+      <w:proofErr w:type="spellEnd"/>
+    </w:p>
+    <w:tbl>
+      <w:tblPr>
+        <w:tblStyle w:val="a3"/>
+        <w:tblW w:w="0" w:type="auto"/>
+        <w:tblLook w:val="04A0" w:firstRow="1" w:lastRow="0" w:firstColumn="1" w:lastColumn="0" w:noHBand="0" w:noVBand="1"/>
+      </w:tblPr>
+      <w:tblGrid>
+        <w:gridCol w:w="3115"/>
+        <w:gridCol w:w="3115"/>
+        <w:gridCol w:w="3115"/>
+      </w:tblGrid>
+      <w:tr>
+        <w:tc>
+          <w:tcPr>
+            <w:tcW w:w="3115" w:type="dxa"/>
+          </w:tcPr>
+          <w:p>
+            <w:r>
+              <w:t>СЛОВО</w:t>
+            </w:r>
+          </w:p>
+        </w:tc>
+        <w:tc>
+          <w:tcPr>
+            <w:tcW w:w="3115" w:type="dxa"/>
+          </w:tcPr>
+          <w:p/>
+        </w:tc>
+        <w:tc>
+          <w:tcPr>
+            <w:tcW w:w="3115" w:type="dxa"/>
+          </w:tcPr>
+          <w:p/>
+        </w:tc>
+      </w:tr>
+      <w:tr>
+        <w:tc>
+          <w:tcPr>
+            <w:tcW w:w="3115" w:type="dxa"/>
+          </w:tcPr>
+          <w:p/>
+        </w:tc>
+        <w:tc>
+          <w:tcPr>
+            <w:tcW w:w="3115" w:type="dxa"/>
+          </w:tcPr>
+          <w:p>
+            <w:pPr>
+              <w:rPr>
+                <w:color w:val="70AD47" w:themeColor="accent6"/>
+              </w:rPr>
+            </w:pPr>
+            <w:r>
+              <w:t>СЛОВО Тут ран. Тут найти. Ещё СЛОВО после.</w:t>
+            </w:r>
+            <w:r>
+              <w:t xml:space="preserve"> </w:t>
+            </w:r>
+            <w:r>
+              <w:t xml:space="preserve">Дальше должен идти </w:t>
+            </w:r>
+            <w:r>
+              <w:rPr>
+                <w:lang w:val="en-US"/>
+              </w:rPr>
+              <w:t>hard</w:t>
+            </w:r>
+            <w:r>
+              <w:t>-</w:t>
+            </w:r>
+            <w:r>
+              <w:rPr>
+                <w:lang w:val="en-US"/>
+              </w:rPr>
+              <w:t>wrap</w:t>
+            </w:r>
+            <w:r>
+              <w:t>.</w:t>
+            </w:r>
+            <w:r>
+              <w:t xml:space="preserve"> СЛО</w:t>
+            </w:r>
+            <w:r>
+              <w:rPr>
+                <w:color w:val="70AD47" w:themeColor="accent6"/>
+              </w:rPr>
+              <w:t>ВО</w:t>
+            </w:r>
+          </w:p>
+          <w:p>
+            <w:r>
+              <w:rPr>
+                <w:color w:val="70AD47" w:themeColor="accent6"/>
+              </w:rPr>
+              <w:t xml:space="preserve">СЛОВО </w:t>
+            </w:r>
+            <w:proofErr w:type="spellStart"/>
+            <w:r>
+              <w:rPr>
+                <w:color w:val="70AD47" w:themeColor="accent6"/>
+              </w:rPr>
+              <w:t>СЛОВО</w:t>
+            </w:r>
+            <w:proofErr w:type="spellEnd"/>
+            <w:r>
+              <w:rPr>
+                <w:color w:val="70AD47" w:themeColor="accent6"/>
+              </w:rPr>
+              <w:t xml:space="preserve"> </w:t>
+            </w:r>
+            <w:proofErr w:type="spellStart"/>
+            <w:r>
+              <w:rPr>
+                <w:color w:val="70AD47" w:themeColor="accent6"/>
+              </w:rPr>
+              <w:t>СЛОВО</w:t>
+            </w:r>
+            <w:proofErr w:type="spellEnd"/>
+            <w:r>
+              <w:rPr>
+                <w:color w:val="70AD47" w:themeColor="accent6"/>
+              </w:rPr>
+              <w:t xml:space="preserve"> </w:t>
+            </w:r>
+            <w:proofErr w:type="spellStart"/>
+            <w:r>
+              <w:rPr>
+                <w:color w:val="70AD47" w:themeColor="accent6"/>
+              </w:rPr>
+              <w:t>СЛОВО</w:t>
+            </w:r>
+            <w:proofErr w:type="spellEnd"/>
+            <w:r>
+              <w:rPr>
+                <w:color w:val="70AD47" w:themeColor="accent6"/>
+              </w:rPr>
+              <w:t xml:space="preserve"> </w:t>
+            </w:r>
+            <w:proofErr w:type="spellStart"/>
+            <w:r>
+              <w:rPr>
+                <w:color w:val="70AD47" w:themeColor="accent6"/>
+              </w:rPr>
+              <w:t>Соло</w:t>
+            </w:r>
+            <w:r>
+              <w:rPr>
+                <w:color w:val="C45911" w:themeColor="accent2" w:themeShade="BF"/>
+              </w:rPr>
+              <w:t>ЛОВО</w:t>
+            </w:r>
+            <w:proofErr w:type="spellEnd"/>
+            <w:r>
+              <w:rPr>
+                <w:color w:val="C45911" w:themeColor="accent2" w:themeShade="BF"/>
+              </w:rPr>
+              <w:t xml:space="preserve"> </w:t>
+            </w:r>
+            <w:proofErr w:type="spellStart"/>
+            <w:r>
+              <w:rPr>
+                <w:color w:val="4472C4" w:themeColor="accent1"/>
+              </w:rPr>
+              <w:t>СЛОВ</w:t>
+            </w:r>
+            <w:r>
+              <w:rPr>
+                <w:color w:val="4472C4" w:themeColor="accent1"/>
+              </w:rPr>
+              <w:t>нет</w:t>
+            </w:r>
+            <w:r>
+              <w:rPr>
+                <w:color w:val="FFD966" w:themeColor="accent4" w:themeTint="99"/>
+              </w:rPr>
+              <w:t>О</w:t>
+            </w:r>
+            <w:proofErr w:type="spellEnd"/>
+          </w:p>
+          <w:p/>
+        </w:tc>
+        <w:tc>
+          <w:tcPr>
+            <w:tcW w:w="3115" w:type="dxa"/>
+          </w:tcPr>
+          <w:p>
+            <w:r>
+              <w:t xml:space="preserve">Просто </w:t>
+            </w:r>
+            <w:r>
+              <w:rPr>
+                <w:u w:val="single"/>
+              </w:rPr>
+              <w:t>параграф</w:t>
+            </w:r>
+            <w:r>
+              <w:t xml:space="preserve"> с </w:t>
+            </w:r>
+            <w:r>
+              <w:rPr>
+                <w:b/>
+                <w:bCs/>
+              </w:rPr>
+              <w:t>некоторым</w:t>
+            </w:r>
+            <w:r>
+              <w:t xml:space="preserve"> </w:t>
+            </w:r>
+            <w:proofErr w:type="spellStart"/>
+            <w:r>
+              <w:rPr>
+                <w:i/>
+                <w:iCs/>
+                <w:sz w:val="32"/>
+                <w:szCs w:val="32"/>
+              </w:rPr>
+              <w:t>СЛОВОм</w:t>
+            </w:r>
+            <w:proofErr w:type="spellEnd"/>
+            <w:r>
+              <w:rPr>
+                <w:sz w:val="32"/>
+                <w:szCs w:val="32"/>
+              </w:rPr>
+              <w:t xml:space="preserve"> </w:t>
+            </w:r>
+            <w:r>
+              <w:t xml:space="preserve">и </w:t>
+            </w:r>
+            <w:r>
+              <w:rPr>
+                <w:highlight w:val="yellow"/>
+              </w:rPr>
+              <w:t>особым</w:t>
+            </w:r>
+            <w:r>
+              <w:t xml:space="preserve"> форматированием</w:t>
+            </w:r>
+          </w:p>
+          <w:p/>
+        </w:tc>
+      </w:tr>
+      <w:tr>
+        <w:tc>
+          <w:tcPr>
+            <w:tcW w:w="3115" w:type="dxa"/>
+          </w:tcPr>
+          <w:p>
+            <w:r>
+              <w:t>ФРАЗА</w:t>
+            </w:r>
+          </w:p>
+        </w:tc>
+        <w:tc>
+          <w:tcPr>
+            <w:tcW w:w="3115" w:type="dxa"/>
+          </w:tcPr>
+          <w:p>
+            <w:r>
+              <w:t>КОТОРУЮ</w:t>
+            </w:r>
+          </w:p>
+        </w:tc>
+        <w:tc>
+          <w:tcPr>
+            <w:tcW w:w="3115" w:type="dxa"/>
+          </w:tcPr>
+          <w:p>
+            <w:r>
+              <w:t>КРАСИМ</w:t>
+            </w:r>
+          </w:p>
+        </w:tc>
+      </w:tr>
+    </w:tbl>
+    <w:p/>
+    <w:tbl>
+      <w:tblPr>
+        <w:tblStyle w:val="a3"/>
+        <w:tblW w:w="0" w:type="auto"/>
+        <w:tblLook w:val="04A0" w:firstRow="1" w:lastRow="0" w:firstColumn="1" w:lastColumn="0" w:noHBand="0" w:noVBand="1"/>
+      </w:tblPr>
+      <w:tblGrid>
+        <w:gridCol w:w="3115"/>
+        <w:gridCol w:w="3115"/>
+        <w:gridCol w:w="3115"/>
+      </w:tblGrid>
+      <w:tr>
+        <w:tc>
+          <w:tcPr>
+            <w:tcW w:w="3115" w:type="dxa"/>
+          </w:tcPr>
+          <w:p>
+            <w:r>
+              <w:t>СЛОВО</w:t>
+            </w:r>
+          </w:p>
+        </w:tc>
+        <w:tc>
+          <w:tcPr>
+            <w:tcW w:w="3115" w:type="dxa"/>
+          </w:tcPr>
+          <w:p/>
+        </w:tc>
+        <w:tc>
+          <w:tcPr>
+            <w:tcW w:w="3115" w:type="dxa"/>
+          </w:tcPr>
+          <w:p/>
+        </w:tc>
+      </w:tr>
+      <w:tr>
+        <w:tc>
+          <w:tcPr>
+            <w:tcW w:w="3115" w:type="dxa"/>
+          </w:tcPr>
+          <w:p/>
+        </w:tc>
+        <w:tc>
+          <w:tcPr>
+            <w:tcW w:w="6230" w:type="dxa"/>
+            <w:gridSpan w:val="2"/>
+          </w:tcPr>
+          <w:p>
+            <w:pPr>
+              <w:rPr>
+                <w:color w:val="70AD47" w:themeColor="accent6"/>
+              </w:rPr>
+            </w:pPr>
+            <w:r>
+              <w:t>СЛОВО Тут ран. Тут найти. Ещё СЛОВО после.</w:t>
+            </w:r>
+            <w:r>
+              <w:t xml:space="preserve"> </w:t>
+            </w:r>
+            <w:r>
+              <w:t xml:space="preserve">Дальше должен идти </w:t>
+            </w:r>
+            <w:r>
+              <w:rPr>
+                <w:lang w:val="en-US"/>
+              </w:rPr>
+              <w:t>hard</w:t>
+            </w:r>
+            <w:r>
+              <w:t>-</w:t>
+            </w:r>
+            <w:r>
+              <w:rPr>
+                <w:lang w:val="en-US"/>
+              </w:rPr>
+              <w:t>wrap</w:t>
+            </w:r>
+            <w:r>
+              <w:t>.</w:t>
+            </w:r>
+            <w:r>
+              <w:t xml:space="preserve"> СЛО</w:t>
+            </w:r>
+            <w:r>
+              <w:rPr>
+                <w:color w:val="70AD47" w:themeColor="accent6"/>
+              </w:rPr>
+              <w:t>ВО</w:t>
+            </w:r>
+          </w:p>
+          <w:p>
+            <w:r>
+              <w:rPr>
+                <w:color w:val="70AD47" w:themeColor="accent6"/>
+              </w:rPr>
+              <w:t xml:space="preserve">СЛОВО </w:t>
+            </w:r>
+            <w:proofErr w:type="spellStart"/>
+            <w:r>
+              <w:rPr>
+                <w:color w:val="70AD47" w:themeColor="accent6"/>
+              </w:rPr>
+              <w:t>СЛОВО</w:t>
+            </w:r>
+            <w:proofErr w:type="spellEnd"/>
+            <w:r>
+              <w:rPr>
+                <w:color w:val="70AD47" w:themeColor="accent6"/>
+              </w:rPr>
+              <w:t xml:space="preserve"> </w:t>
+            </w:r>
+            <w:proofErr w:type="spellStart"/>
+            <w:r>
+              <w:rPr>
+                <w:color w:val="70AD47" w:themeColor="accent6"/>
+              </w:rPr>
+              <w:t>СЛОВО</w:t>
+            </w:r>
+            <w:proofErr w:type="spellEnd"/>
+            <w:r>
+              <w:rPr>
+                <w:color w:val="70AD47" w:themeColor="accent6"/>
+              </w:rPr>
+              <w:t xml:space="preserve"> </w:t>
+            </w:r>
+            <w:proofErr w:type="spellStart"/>
+            <w:r>
+              <w:rPr>
+                <w:color w:val="70AD47" w:themeColor="accent6"/>
+              </w:rPr>
+              <w:t>СЛОВО</w:t>
+            </w:r>
+            <w:proofErr w:type="spellEnd"/>
+            <w:r>
+              <w:rPr>
+                <w:color w:val="70AD47" w:themeColor="accent6"/>
+              </w:rPr>
+              <w:t xml:space="preserve"> </w:t>
+            </w:r>
+            <w:proofErr w:type="spellStart"/>
+            <w:r>
+              <w:rPr>
+                <w:color w:val="70AD47" w:themeColor="accent6"/>
+              </w:rPr>
+              <w:t>Соло</w:t>
+            </w:r>
+            <w:r>
+              <w:rPr>
+                <w:color w:val="C45911" w:themeColor="accent2" w:themeShade="BF"/>
+              </w:rPr>
+              <w:t>ЛОВО</w:t>
+            </w:r>
+            <w:proofErr w:type="spellEnd"/>
+            <w:r>
+              <w:rPr>
+                <w:color w:val="C45911" w:themeColor="accent2" w:themeShade="BF"/>
+              </w:rPr>
+              <w:t xml:space="preserve"> </w:t>
+            </w:r>
+            <w:proofErr w:type="spellStart"/>
+            <w:r>
+              <w:rPr>
+                <w:color w:val="4472C4" w:themeColor="accent1"/>
+              </w:rPr>
+              <w:t>СЛОВ</w:t>
+            </w:r>
+            <w:r>
+              <w:rPr>
+                <w:color w:val="4472C4" w:themeColor="accent1"/>
+              </w:rPr>
+              <w:t>нет</w:t>
+            </w:r>
+            <w:r>
+              <w:rPr>
+                <w:color w:val="FFD966" w:themeColor="accent4" w:themeTint="99"/>
+              </w:rPr>
+              <w:t>О</w:t>
+            </w:r>
+            <w:proofErr w:type="spellEnd"/>
+          </w:p>
+          <w:p>
+            <w:r>
+              <w:t xml:space="preserve">Просто </w:t>
+            </w:r>
+            <w:r>
+              <w:rPr>
+                <w:u w:val="single"/>
+              </w:rPr>
+              <w:t>параграф</w:t>
+            </w:r>
+            <w:r>
+              <w:t xml:space="preserve"> с </w:t>
+            </w:r>
+            <w:r>
+              <w:rPr>
+                <w:b/>
+                <w:bCs/>
+              </w:rPr>
+              <w:t>некоторым</w:t>
+            </w:r>
+            <w:r>
+              <w:t xml:space="preserve"> </w:t>
+            </w:r>
+            <w:proofErr w:type="spellStart"/>
+            <w:r>
+              <w:rPr>
+                <w:i/>
+                <w:iCs/>
+                <w:sz w:val="32"/>
+                <w:szCs w:val="32"/>
+              </w:rPr>
+              <w:t>СЛОВОм</w:t>
+            </w:r>
+            <w:proofErr w:type="spellEnd"/>
+            <w:r>
+              <w:rPr>
+                <w:sz w:val="32"/>
+                <w:szCs w:val="32"/>
+              </w:rPr>
+              <w:t xml:space="preserve"> </w:t>
+            </w:r>
+            <w:r>
+              <w:t xml:space="preserve">и </w:t>
+            </w:r>
+            <w:r>
+              <w:rPr>
+                <w:highlight w:val="yellow"/>
+              </w:rPr>
+              <w:t>особым</w:t>
+            </w:r>
+            <w:r>
+              <w:t xml:space="preserve"> форматированием</w:t>
+            </w:r>
+          </w:p>
+          <w:p/>
+        </w:tc>
+      </w:tr>
+      <w:tr>
+        <w:tc>
+          <w:tcPr>
+            <w:tcW w:w="6230" w:type="dxa"/>
+            <w:gridSpan w:val="2"/>
+          </w:tcPr>
+          <w:p>
+            <w:r>
+              <w:t>ФРАЗА</w:t>
+            </w:r>
+          </w:p>
+          <w:p>
+            <w:r>
+              <w:t>КОТОРУЮ</w:t>
+            </w:r>
+          </w:p>
+        </w:tc>
+        <w:tc>
+          <w:tcPr>
+            <w:tcW w:w="3115" w:type="dxa"/>
+          </w:tcPr>
+          <w:p>
+            <w:r>
+              <w:t>КРАСИМ</w:t>
+            </w:r>
+          </w:p>
+        </w:tc>
+      </w:tr>
+    </w:tbl>
+    <w:p/>
+    <w:p>
       <w:r>
         <w:br w:type="page"/>
       </w:r>
@@ -371,6 +989,7 @@
           <w:szCs w:val="96"/>
         </w:rPr>
       </w:pPr>
+      <w:proofErr w:type="spellStart"/>
       <w:r>
         <w:rPr>
           <w:sz w:val="96"/>
@@ -379,6 +998,7 @@
         <w:lastRenderedPageBreak/>
         <w:t>йййййййййййййййййййййййййййййй</w:t>
       </w:r>
+      <w:proofErr w:type="spellEnd"/>
     </w:p>
     <w:sectPr>
       <w:pgSz w:w="11906" w:h="16838"/>
@@ -816,6 +1436,25 @@
     <w:semiHidden/>
     <w:unhideWhenUsed/>
   </w:style>
+  <w:style w:type="table" w:styleId="a3">
+    <w:name w:val="Table Grid"/>
+    <w:basedOn w:val="a1"/>
+    <w:uiPriority w:val="39"/>
+    <w:rsid w:val="00B10B64"/>
+    <w:pPr>
+      <w:spacing w:after="0" w:line="240" w:lineRule="auto"/>
+    </w:pPr>
+    <w:tblPr>
+      <w:tblBorders>
+        <w:top w:val="single" w:sz="4" w:space="0" w:color="auto"/>
+        <w:left w:val="single" w:sz="4" w:space="0" w:color="auto"/>
+        <w:bottom w:val="single" w:sz="4" w:space="0" w:color="auto"/>
+        <w:right w:val="single" w:sz="4" w:space="0" w:color="auto"/>
+        <w:insideH w:val="single" w:sz="4" w:space="0" w:color="auto"/>
+        <w:insideV w:val="single" w:sz="4" w:space="0" w:color="auto"/>
+      </w:tblBorders>
+    </w:tblPr>
+  </w:style>
 </w:styles>
 </file>
 

</xml_diff>